<commit_message>
fix(c02-c11): repair confirmed LOT 1 identity and workbook defects
C11 Date_MASTER START: rescris din framing C10/MASURI in C11/CLASAMENT
(CONSTRUIREA CLASAMENTELOR), AHA oficial din HTML. Date, formule si
celelalte sheet-uri intacte.

C02 identitate vizibila aliniata la nomenclatura LOCKED (CUVANT=ADEVAR,
MIZA HERO=CONFRUNTAREA CU REALITATEA):
- Video + Editor-Video: title C02 CONTROL -> ADEVAR; hero ADEVARUL
  DATELOR -> CONFRUNTAREA CU REALITATEA; topbar Confruntare -> ADEVAR.
- FILM header + semnatura: CONTROLUL DATELOR -> CONFRUNTAREA CU REALITATEA.
- Studiu + Editor-Studiu: footer C02 CONTROL -> CONFRUNTARE (contaminare
  C19 ratata de propagarea V69, expusa de detectorul R-V58.filmname).

Nu s-au atins: hook, AHA, payoff, text educational, script/narativ FILM,
pasi, timing, date, formule, assets, restul constructiilor.
audit_sync: zero drift nou. gate_v20 C02 + C11: PASS.
</commit_message>
<xml_diff>
--- a/c02/FILM-Excel-02-Confruntare.docx
+++ b/c02/FILM-Excel-02-Confruntare.docx
@@ -8,7 +8,7 @@
           <w:b/>
           <w:sz w:val="44"/>
         </w:rPr>
-        <w:t>FILM · C02 CONTROLUL DATELOR</w:t>
+        <w:t>FILM · C02 CONFRUNTAREA CU REALITATEA</w:t>
       </w:r>
     </w:p>
     <w:p>
@@ -2129,7 +2129,7 @@
           <w:rFonts w:ascii="Calibri" w:hAnsi="Calibri"/>
           <w:sz w:val="20"/>
         </w:rPr>
-        <w:t>Pack 02 Excel · Constructia 02 CONTROLUL DATELOR.</w:t>
+        <w:t>Pack 02 Excel · Constructia 02 CONFRUNTAREA CU REALITATEA.</w:t>
       </w:r>
     </w:p>
     <w:p>

</xml_diff>